<commit_message>
Update UI, Usecase Diagram and RDERD Diagramhttps://stitch.withgoogle.com/projects/15595109852778882620https://stitch.withgoogle.com/projects/15595109852778882620 CVerify_SRS.docx
Replace the CVerify System Requirements Specification (CVerify_SRS.docx) with an updated DOCX file. The change is a binary update so textual diffs are not shown here—review the updated document for requirement edits, clarifications, or formatting changes.
</commit_message>
<xml_diff>
--- a/CVerify_SRS.docx
+++ b/CVerify_SRS.docx
@@ -8,6 +8,8 @@
         <w:bidi w:val="0"/>
         <w:jc w:val="center"/>
       </w:pPr>
+      <w:bookmarkStart w:id="3" w:name="_GoBack"/>
+      <w:bookmarkEnd w:id="3"/>
       <w:bookmarkStart w:id="0" w:name="_ux1j9jtg0oxr" w:colFirst="0" w:colLast="0"/>
       <w:bookmarkEnd w:id="0"/>
       <w:r>
@@ -11684,6 +11686,7 @@
     <w:p>
       <w:pPr>
         <w:numPr>
+          <w:ilvl w:val="0"/>
           <w:numId w:val="0"/>
         </w:numPr>
         <w:spacing w:before="80" w:after="0"/>
@@ -11756,6 +11759,7 @@
     <w:p>
       <w:pPr>
         <w:numPr>
+          <w:ilvl w:val="0"/>
           <w:numId w:val="0"/>
         </w:numPr>
         <w:spacing w:before="80" w:after="0"/>
@@ -11784,6 +11788,7 @@
     <w:p>
       <w:pPr>
         <w:numPr>
+          <w:ilvl w:val="0"/>
           <w:numId w:val="0"/>
         </w:numPr>
         <w:spacing w:before="80" w:after="0"/>
@@ -11835,6 +11840,7 @@
     <w:p>
       <w:pPr>
         <w:numPr>
+          <w:ilvl w:val="0"/>
           <w:numId w:val="0"/>
         </w:numPr>
         <w:spacing w:before="80" w:after="0"/>
@@ -11843,6 +11849,7 @@
     <w:p>
       <w:pPr>
         <w:numPr>
+          <w:ilvl w:val="0"/>
           <w:numId w:val="0"/>
         </w:numPr>
         <w:spacing w:before="80" w:after="0"/>
@@ -11908,6 +11915,7 @@
     <w:p>
       <w:pPr>
         <w:numPr>
+          <w:ilvl w:val="0"/>
           <w:numId w:val="0"/>
         </w:numPr>
         <w:spacing w:before="80" w:after="0"/>
@@ -11916,6 +11924,7 @@
     <w:p>
       <w:pPr>
         <w:numPr>
+          <w:ilvl w:val="0"/>
           <w:numId w:val="0"/>
         </w:numPr>
         <w:spacing w:before="80" w:after="0"/>
@@ -11924,6 +11933,7 @@
     <w:p>
       <w:pPr>
         <w:numPr>
+          <w:ilvl w:val="0"/>
           <w:numId w:val="0"/>
         </w:numPr>
         <w:spacing w:before="80" w:after="0"/>
@@ -11932,6 +11942,7 @@
     <w:p>
       <w:pPr>
         <w:numPr>
+          <w:ilvl w:val="0"/>
           <w:numId w:val="0"/>
         </w:numPr>
         <w:spacing w:before="80" w:after="0"/>
@@ -11940,6 +11951,7 @@
     <w:p>
       <w:pPr>
         <w:numPr>
+          <w:ilvl w:val="0"/>
           <w:numId w:val="0"/>
         </w:numPr>
         <w:spacing w:before="80" w:after="0"/>
@@ -11948,6 +11960,7 @@
     <w:p>
       <w:pPr>
         <w:numPr>
+          <w:ilvl w:val="0"/>
           <w:numId w:val="0"/>
         </w:numPr>
         <w:spacing w:before="80" w:after="0"/>
@@ -11956,6 +11969,7 @@
     <w:p>
       <w:pPr>
         <w:numPr>
+          <w:ilvl w:val="0"/>
           <w:numId w:val="0"/>
         </w:numPr>
         <w:spacing w:before="80" w:after="0"/>
@@ -11964,6 +11978,7 @@
     <w:p>
       <w:pPr>
         <w:numPr>
+          <w:ilvl w:val="0"/>
           <w:numId w:val="0"/>
         </w:numPr>
         <w:spacing w:before="80" w:after="0"/>
@@ -11972,6 +11987,7 @@
     <w:p>
       <w:pPr>
         <w:numPr>
+          <w:ilvl w:val="0"/>
           <w:numId w:val="0"/>
         </w:numPr>
         <w:spacing w:before="80" w:after="0"/>
@@ -11980,6 +11996,7 @@
     <w:p>
       <w:pPr>
         <w:numPr>
+          <w:ilvl w:val="0"/>
           <w:numId w:val="0"/>
         </w:numPr>
         <w:spacing w:before="80" w:after="0"/>
@@ -11988,6 +12005,7 @@
     <w:p>
       <w:pPr>
         <w:numPr>
+          <w:ilvl w:val="0"/>
           <w:numId w:val="0"/>
         </w:numPr>
         <w:spacing w:before="80" w:after="0"/>
@@ -12007,6 +12025,7 @@
     <w:p>
       <w:pPr>
         <w:numPr>
+          <w:ilvl w:val="0"/>
           <w:numId w:val="0"/>
         </w:numPr>
         <w:spacing w:before="80" w:after="0"/>
@@ -12058,6 +12077,7 @@
     <w:p>
       <w:pPr>
         <w:numPr>
+          <w:ilvl w:val="0"/>
           <w:numId w:val="0"/>
         </w:numPr>
         <w:spacing w:before="80" w:after="0"/>
@@ -12066,6 +12086,7 @@
     <w:p>
       <w:pPr>
         <w:numPr>
+          <w:ilvl w:val="0"/>
           <w:numId w:val="0"/>
         </w:numPr>
         <w:spacing w:before="80" w:after="0"/>
@@ -12074,6 +12095,7 @@
     <w:p>
       <w:pPr>
         <w:numPr>
+          <w:ilvl w:val="0"/>
           <w:numId w:val="0"/>
         </w:numPr>
         <w:spacing w:before="80" w:after="0"/>
@@ -12082,6 +12104,7 @@
     <w:p>
       <w:pPr>
         <w:numPr>
+          <w:ilvl w:val="0"/>
           <w:numId w:val="0"/>
         </w:numPr>
         <w:spacing w:before="80" w:after="0"/>
@@ -12090,6 +12113,7 @@
     <w:p>
       <w:pPr>
         <w:numPr>
+          <w:ilvl w:val="0"/>
           <w:numId w:val="0"/>
         </w:numPr>
         <w:spacing w:before="80" w:after="0"/>
@@ -12098,6 +12122,7 @@
     <w:p>
       <w:pPr>
         <w:numPr>
+          <w:ilvl w:val="0"/>
           <w:numId w:val="0"/>
         </w:numPr>
         <w:spacing w:before="80" w:after="0"/>
@@ -12106,6 +12131,7 @@
     <w:p>
       <w:pPr>
         <w:numPr>
+          <w:ilvl w:val="0"/>
           <w:numId w:val="0"/>
         </w:numPr>
         <w:spacing w:before="80" w:after="0"/>
@@ -12114,6 +12140,7 @@
     <w:p>
       <w:pPr>
         <w:numPr>
+          <w:ilvl w:val="0"/>
           <w:numId w:val="0"/>
         </w:numPr>
         <w:spacing w:before="80" w:after="0"/>
@@ -12122,6 +12149,7 @@
     <w:p>
       <w:pPr>
         <w:numPr>
+          <w:ilvl w:val="0"/>
           <w:numId w:val="0"/>
         </w:numPr>
         <w:spacing w:before="80" w:after="0"/>
@@ -12130,6 +12158,7 @@
     <w:p>
       <w:pPr>
         <w:numPr>
+          <w:ilvl w:val="0"/>
           <w:numId w:val="0"/>
         </w:numPr>
         <w:spacing w:before="80" w:after="0"/>
@@ -12138,6 +12167,7 @@
     <w:p>
       <w:pPr>
         <w:numPr>
+          <w:ilvl w:val="0"/>
           <w:numId w:val="0"/>
         </w:numPr>
         <w:spacing w:before="80" w:after="0"/>
@@ -12146,6 +12176,7 @@
     <w:p>
       <w:pPr>
         <w:numPr>
+          <w:ilvl w:val="0"/>
           <w:numId w:val="0"/>
         </w:numPr>
         <w:spacing w:before="80" w:after="0"/>
@@ -12154,6 +12185,7 @@
     <w:p>
       <w:pPr>
         <w:numPr>
+          <w:ilvl w:val="0"/>
           <w:numId w:val="0"/>
         </w:numPr>
         <w:spacing w:before="80" w:after="0"/>
@@ -12162,6 +12194,7 @@
     <w:p>
       <w:pPr>
         <w:numPr>
+          <w:ilvl w:val="0"/>
           <w:numId w:val="0"/>
         </w:numPr>
         <w:spacing w:before="80" w:after="0"/>
@@ -12170,6 +12203,7 @@
     <w:p>
       <w:pPr>
         <w:numPr>
+          <w:ilvl w:val="0"/>
           <w:numId w:val="0"/>
         </w:numPr>
         <w:spacing w:before="80" w:after="0"/>
@@ -12178,6 +12212,7 @@
     <w:p>
       <w:pPr>
         <w:numPr>
+          <w:ilvl w:val="0"/>
           <w:numId w:val="0"/>
         </w:numPr>
         <w:spacing w:before="80" w:after="0"/>
@@ -12186,6 +12221,7 @@
     <w:p>
       <w:pPr>
         <w:numPr>
+          <w:ilvl w:val="0"/>
           <w:numId w:val="0"/>
         </w:numPr>
         <w:spacing w:before="80" w:after="0"/>
@@ -12194,6 +12230,7 @@
     <w:p>
       <w:pPr>
         <w:numPr>
+          <w:ilvl w:val="0"/>
           <w:numId w:val="0"/>
         </w:numPr>
         <w:spacing w:before="80" w:after="0"/>
@@ -12202,6 +12239,7 @@
     <w:p>
       <w:pPr>
         <w:numPr>
+          <w:ilvl w:val="0"/>
           <w:numId w:val="0"/>
         </w:numPr>
         <w:spacing w:before="80" w:after="0"/>
@@ -12210,6 +12248,7 @@
     <w:p>
       <w:pPr>
         <w:numPr>
+          <w:ilvl w:val="0"/>
           <w:numId w:val="0"/>
         </w:numPr>
         <w:spacing w:before="80" w:after="0"/>
@@ -12229,6 +12268,7 @@
     <w:p>
       <w:pPr>
         <w:numPr>
+          <w:ilvl w:val="0"/>
           <w:numId w:val="0"/>
         </w:numPr>
         <w:spacing w:before="80" w:after="0"/>
@@ -12290,6 +12330,7 @@
     <w:p>
       <w:pPr>
         <w:numPr>
+          <w:ilvl w:val="0"/>
           <w:numId w:val="0"/>
         </w:numPr>
         <w:spacing w:before="80" w:after="0"/>
@@ -12303,6 +12344,7 @@
     <w:p>
       <w:pPr>
         <w:numPr>
+          <w:ilvl w:val="0"/>
           <w:numId w:val="0"/>
         </w:numPr>
         <w:spacing w:before="80" w:after="0"/>
@@ -12316,6 +12358,7 @@
     <w:p>
       <w:pPr>
         <w:numPr>
+          <w:ilvl w:val="0"/>
           <w:numId w:val="0"/>
         </w:numPr>
         <w:spacing w:before="80" w:after="0"/>
@@ -12329,6 +12372,7 @@
     <w:p>
       <w:pPr>
         <w:numPr>
+          <w:ilvl w:val="0"/>
           <w:numId w:val="0"/>
         </w:numPr>
         <w:spacing w:before="80" w:after="0"/>
@@ -12352,6 +12396,7 @@
     <w:p>
       <w:pPr>
         <w:numPr>
+          <w:ilvl w:val="0"/>
           <w:numId w:val="0"/>
         </w:numPr>
         <w:spacing w:before="80" w:after="0"/>
@@ -28350,6 +28395,7 @@
       <w:pPr>
         <w:pStyle w:val="16"/>
         <w:numPr>
+          <w:ilvl w:val="0"/>
           <w:numId w:val="0"/>
         </w:numPr>
         <w:spacing w:before="40" w:after="40"/>
@@ -31990,6 +32036,7 @@
       <w:pPr>
         <w:pStyle w:val="16"/>
         <w:numPr>
+          <w:ilvl w:val="0"/>
           <w:numId w:val="0"/>
         </w:numPr>
         <w:spacing w:before="40" w:after="40"/>
@@ -32004,6 +32051,7 @@
       <w:pPr>
         <w:pStyle w:val="16"/>
         <w:numPr>
+          <w:ilvl w:val="0"/>
           <w:numId w:val="0"/>
         </w:numPr>
         <w:spacing w:before="40" w:after="40"/>
@@ -32018,6 +32066,7 @@
       <w:pPr>
         <w:pStyle w:val="16"/>
         <w:numPr>
+          <w:ilvl w:val="0"/>
           <w:numId w:val="0"/>
         </w:numPr>
         <w:spacing w:before="40" w:after="40"/>
@@ -32042,6 +32091,7 @@
       <w:pPr>
         <w:pStyle w:val="16"/>
         <w:numPr>
+          <w:ilvl w:val="0"/>
           <w:numId w:val="0"/>
         </w:numPr>
         <w:spacing w:before="40" w:after="40"/>
@@ -32073,8 +32123,6 @@
         </w:rPr>
         <w:t>5.2 Hardware Interfaces</w:t>
       </w:r>
-      <w:bookmarkStart w:id="3" w:name="_GoBack"/>
-      <w:bookmarkEnd w:id="3"/>
     </w:p>
     <w:p>
       <w:pPr>
@@ -43182,7 +43230,7 @@
     <w:lsdException w:unhideWhenUsed="0" w:uiPriority="0" w:semiHidden="0" w:name="toc 8"/>
     <w:lsdException w:unhideWhenUsed="0" w:uiPriority="0" w:semiHidden="0" w:name="toc 9"/>
     <w:lsdException w:unhideWhenUsed="0" w:uiPriority="0" w:semiHidden="0" w:name="Normal Indent"/>
-    <w:lsdException w:uiPriority="99" w:name="footnote text"/>
+    <w:lsdException w:qFormat="1" w:uiPriority="99" w:name="footnote text"/>
     <w:lsdException w:unhideWhenUsed="0" w:uiPriority="0" w:semiHidden="0" w:name="annotation text"/>
     <w:lsdException w:unhideWhenUsed="0" w:uiPriority="0" w:semiHidden="0" w:name="header"/>
     <w:lsdException w:unhideWhenUsed="0" w:uiPriority="0" w:semiHidden="0" w:name="footer"/>
@@ -43564,6 +43612,7 @@
     <w:link w:val="17"/>
     <w:semiHidden/>
     <w:unhideWhenUsed/>
+    <w:qFormat/>
     <w:uiPriority w:val="99"/>
     <w:pPr>
       <w:spacing w:after="0" w:line="240" w:lineRule="auto"/>

</xml_diff>